<commit_message>
Tighten M12 spoiler gating and deck metadata
Co-authored-by: shaseaver25 <shannon@tailoredu.org>
</commit_message>
<xml_diff>
--- a/teaching-pack/16-M12-misleading-charts/KEY-M12-answer-key.docx
+++ b/teaching-pack/16-M12-misleading-charts/KEY-M12-answer-key.docx
@@ -48,6 +48,39 @@
           <w:sz w:val="19"/>
         </w:rPr>
         <w:t>Do not identify the designed errors before students commit H12-01. Tiles A and B require redraws. Tile C is an acceptable comparison chart and prevents the hunt from being a wipeout.</w:t>
+      </w:r>
+    </w:p>
+    <w:p>
+      <w:pPr>
+        <w:spacing w:before="120" w:after="160" w:line="276" w:lineRule="auto"/>
+        <w:pBdr>
+          <w:top w:val="single" w:sz="8" w:space="6" w:color="F2C230"/>
+          <w:left w:val="single" w:sz="8" w:space="6" w:color="F2C230"/>
+          <w:bottom w:val="single" w:sz="8" w:space="6" w:color="F2C230"/>
+          <w:right w:val="single" w:sz="8" w:space="6" w:color="F2C230"/>
+        </w:pBdr>
+        <w:shd w:val="clear" w:fill="FFF6E5"/>
+      </w:pPr>
+      <w:r>
+        <w:rPr>
+          <w:rFonts w:ascii="Barlow Condensed" w:hAnsi="Barlow Condensed" w:cs="Barlow Condensed"/>
+          <w:b/>
+          <w:i w:val="0"/>
+          <w:color w:val="2B2F36"/>
+          <w:sz w:val="19"/>
+          <w:caps w:val="1"/>
+          <w:spacing w:val="10"/>
+        </w:rPr>
+        <w:t xml:space="preserve">Gated materials  </w:t>
+      </w:r>
+      <w:r>
+        <w:rPr>
+          <w:rFonts w:ascii="Barlow" w:hAnsi="Barlow" w:cs="Barlow"/>
+          <w:b w:val="0"/>
+          <w:i w:val="0"/>
+          <w:sz w:val="19"/>
+        </w:rPr>
+        <w:t>Distribute H12-01 and H12-02 first. Keep H12-03, the source CSVs, H12-04, this key, and the reveal deck closed until every student has committed all three initial dispositions.</w:t>
       </w:r>
     </w:p>
     <w:tbl>

</xml_diff>